<commit_message>
Revise Night Signal to accuracy and desaturation scope
Following Ms. Ireland's questions, narrow the project to wearable SpO2 /
heart-rate agreement with a reference oximeter and oxygen desaturation
flagging. Remove all apnea-detection, AHI and severity claims.

- analysis: signal-quality mask, events per hour of valid recording,
  no events across data gaps, demo-data stamps, neutral exploratory wording
- app: flagged desaturation events, valid-signal ring, no sleep score
- slides: revised question, planned protocol, pending results, no conclusion,
  revised appendix and references; old trailer deck withdrawn
- forms: filled revised proposal form (PDF + Word); ethics package revised
- REVIEW_AND_STATUS.md/.pdf: corrected claims, planned vs done, open items

Co-Authored-By: Claude Opus 5.5 <noreply@anthropic.com>
Claude-Session: https://claude.ai/code/session_01CxrUMy4UZKTNYh6kiz9919
</commit_message>
<xml_diff>
--- a/science-fair/night-signal/Night_Signal_Ethics.docx
+++ b/science-fair/night-signal/Night_Signal_Ethics.docx
@@ -14,7 +14,7 @@
           <w:sz w:val="40"/>
           <w:szCs w:val="40"/>
         </w:rPr>
-        <w:t xml:space="preserve">Night Signal: ethics submission package</w:t>
+        <w:t xml:space="preserve">Night Signal: ethics submission package (revised scope)</w:t>
       </w:r>
     </w:p>
     <w:p>
@@ -64,6 +64,97 @@
             <w:tcW w:type="dxa" w:w="10080"/>
             <w:tcBorders>
               <w:top w:val="none"/>
+              <w:left w:val="single" w:color="C98A1E" w:sz="24"/>
+              <w:bottom w:val="none"/>
+              <w:right w:val="none"/>
+            </w:tcBorders>
+            <w:shd w:fill="FBF2DF" w:color="auto" w:val="clear"/>
+            <w:tcMar>
+              <w:top w:type="dxa" w:w="120"/>
+              <w:left w:type="dxa" w:w="180"/>
+              <w:bottom w:type="dxa" w:w="120"/>
+              <w:right w:type="dxa" w:w="180"/>
+            </w:tcMar>
+          </w:tcPr>
+          <w:p>
+            <w:pPr>
+              <w:spacing w:after="100" w:line="276"/>
+            </w:pPr>
+            <w:r>
+              <w:rPr>
+                <w:b/>
+                <w:bCs/>
+                <w:color w:val="8A5A00"/>
+                <w:sz w:val="23"/>
+                <w:szCs w:val="23"/>
+              </w:rPr>
+              <w:t xml:space="preserve">Status of this draft</w:t>
+            </w:r>
+          </w:p>
+          <w:p>
+            <w:pPr>
+              <w:spacing w:after="100" w:line="276"/>
+            </w:pPr>
+            <w:r>
+              <w:rPr>
+                <w:sz w:val="21"/>
+                <w:szCs w:val="21"/>
+              </w:rPr>
+              <w:t xml:space="preserve">This package reflects the revised scope proposed to Ms. Ireland (wearable measurement accuracy and oxygen desaturation detection). </w:t>
+            </w:r>
+            <w:r>
+              <w:rPr>
+                <w:b/>
+                <w:bCs/>
+                <w:sz w:val="21"/>
+                <w:szCs w:val="21"/>
+              </w:rPr>
+              <w:t xml:space="preserve">Her approval of that scope is still pending. </w:t>
+            </w:r>
+            <w:r>
+              <w:rPr>
+                <w:sz w:val="21"/>
+                <w:szCs w:val="21"/>
+              </w:rPr>
+              <w:t xml:space="preserve">No approval, certificate, consent or signature has been obtained yet, and no data has been collected from anyone. Nothing in this package should be submitted until the student has checked it and confirmed with Ms. Ireland.</w:t>
+            </w:r>
+          </w:p>
+        </w:tc>
+      </w:tr>
+    </w:tbl>
+    <w:p>
+      <w:pPr>
+        <w:spacing w:after="100" w:line="276"/>
+      </w:pPr>
+      <w:r>
+        <w:rPr>
+          <w:sz w:val="21"/>
+          <w:szCs w:val="21"/>
+        </w:rPr>
+        <w:t xml:space="preserve"/>
+      </w:r>
+    </w:p>
+    <w:tbl>
+      <w:tblPr>
+        <w:tblW w:type="dxa" w:w="10080"/>
+        <w:tblBorders>
+          <w:top w:val="single" w:color="auto" w:sz="4"/>
+          <w:left w:val="single" w:color="auto" w:sz="4"/>
+          <w:bottom w:val="single" w:color="auto" w:sz="4"/>
+          <w:right w:val="single" w:color="auto" w:sz="4"/>
+          <w:insideH w:val="single" w:color="auto" w:sz="4"/>
+          <w:insideV w:val="single" w:color="auto" w:sz="4"/>
+        </w:tblBorders>
+      </w:tblPr>
+      <w:tblGrid>
+        <w:gridCol w:w="10080"/>
+      </w:tblGrid>
+      <w:tr>
+        <w:tc>
+          <w:tcPr>
+            <w:tcW w:type="dxa" w:w="10080"/>
+            <w:tcBorders>
+              <w:top w:val="none"/>
               <w:left w:val="single" w:color="1F8A9C" w:sz="24"/>
               <w:bottom w:val="none"/>
               <w:right w:val="none"/>
@@ -105,23 +196,7 @@
                 <w:sz w:val="21"/>
                 <w:szCs w:val="21"/>
               </w:rPr>
-              <w:t xml:space="preserve">Go to </w:t>
-            </w:r>
-            <w:r>
-              <w:rPr>
-                <w:b/>
-                <w:bCs/>
-                <w:sz w:val="21"/>
-                <w:szCs w:val="21"/>
-              </w:rPr>
-              <w:t xml:space="preserve">approbation.technoscience.ca</w:t>
-            </w:r>
-            <w:r>
-              <w:rPr>
-                <w:sz w:val="21"/>
-                <w:szCs w:val="21"/>
-              </w:rPr>
-              <w:t xml:space="preserve"> and answer the pre-questionnaire. The likely questions and your answers are in section 1.</w:t>
+              <w:t xml:space="preserve">Confirm with Ms. Ireland that the revised scope is accepted (or ask whether the ethics submission should go ahead in parallel).</w:t>
             </w:r>
           </w:p>
           <w:p>
@@ -138,7 +213,24 @@
                 <w:sz w:val="21"/>
                 <w:szCs w:val="21"/>
               </w:rPr>
-              <w:t xml:space="preserve">When the platform asks for the ethics form, copy and paste sections 2 to 4 (summary, protocol, risk assessment).</w:t>
+              <w:t xml:space="preserve">Fill in every </w:t>
+            </w:r>
+            <w:r>
+              <w:rPr>
+                <w:b/>
+                <w:bCs/>
+                <w:sz w:val="21"/>
+                <w:szCs w:val="21"/>
+                <w:shd w:fill="FFE97A" w:color="auto" w:val="clear"/>
+              </w:rPr>
+              <w:t xml:space="preserve">yellow</w:t>
+            </w:r>
+            <w:r>
+              <w:rPr>
+                <w:sz w:val="21"/>
+                <w:szCs w:val="21"/>
+              </w:rPr>
+              <w:t xml:space="preserve"> box: grade, supervisor's name, school and contact details.</w:t>
             </w:r>
           </w:p>
           <w:p>
@@ -155,7 +247,23 @@
                 <w:sz w:val="21"/>
                 <w:szCs w:val="21"/>
               </w:rPr>
-              <w:t xml:space="preserve">Attach the blank data sheets in section 6 (the platform asks for all blank data collection tools).</w:t>
+              <w:t xml:space="preserve">Go to </w:t>
+            </w:r>
+            <w:r>
+              <w:rPr>
+                <w:b/>
+                <w:bCs/>
+                <w:sz w:val="21"/>
+                <w:szCs w:val="21"/>
+              </w:rPr>
+              <w:t xml:space="preserve">approbation.technoscience.ca</w:t>
+            </w:r>
+            <w:r>
+              <w:rPr>
+                <w:sz w:val="21"/>
+                <w:szCs w:val="21"/>
+              </w:rPr>
+              <w:t xml:space="preserve"> and answer the pre-questionnaire. Section 1 lists the questions it will most likely ask; check them against the real platform.</w:t>
             </w:r>
           </w:p>
           <w:p>
@@ -172,24 +280,7 @@
                 <w:sz w:val="21"/>
                 <w:szCs w:val="21"/>
               </w:rPr>
-              <w:t xml:space="preserve">Fill in every </w:t>
-            </w:r>
-            <w:r>
-              <w:rPr>
-                <w:b/>
-                <w:bCs/>
-                <w:sz w:val="21"/>
-                <w:szCs w:val="21"/>
-                <w:shd w:fill="FFE97A" w:color="auto" w:val="clear"/>
-              </w:rPr>
-              <w:t xml:space="preserve">yellow</w:t>
-            </w:r>
-            <w:r>
-              <w:rPr>
-                <w:sz w:val="21"/>
-                <w:szCs w:val="21"/>
-              </w:rPr>
-              <w:t xml:space="preserve"> box first: your supervisor's name, school and contact details.</w:t>
+              <w:t xml:space="preserve">When the platform asks for the ethics form, use sections 2 to 4 (summary, protocol, risk assessment), and attach the blank data sheets in section 6.</w:t>
             </w:r>
           </w:p>
           <w:p>
@@ -208,14 +299,14 @@
                 <w:sz w:val="21"/>
                 <w:szCs w:val="21"/>
               </w:rPr>
-              <w:t xml:space="preserve">Wait for the Certificate of Approval</w:t>
+              <w:t xml:space="preserve">Wait for the Certificate of Approval and signed consent</w:t>
             </w:r>
             <w:r>
               <w:rPr>
                 <w:sz w:val="21"/>
                 <w:szCs w:val="21"/>
               </w:rPr>
-              <w:t xml:space="preserve"> before any recorded test, even on yourself. You can build the device and check that the electronics work before then.</w:t>
+              <w:t xml:space="preserve"> before any recorded test, even on yourself. Building the device and checking the electronics without wearing it can happen before then, if Ms. Ireland agrees.</w:t>
             </w:r>
           </w:p>
         </w:tc>
@@ -252,7 +343,7 @@
           <w:sz w:val="21"/>
           <w:szCs w:val="21"/>
         </w:rPr>
-        <w:t xml:space="preserve">the approval website could not be opened from here, so section 1 lists the questions it will most likely ask. The rest follows what Technoscience asks for: protocol, risk assessment, data collection tools, supervisor details and consent.</w:t>
+        <w:t xml:space="preserve">the approval website could not be opened while preparing this draft, so section 1 is a best guess at its questions. The rest follows what Technoscience asks for: protocol, risk assessment, data collection tools, supervisor details and consent.</w:t>
       </w:r>
     </w:p>
     <w:p>
@@ -493,7 +584,7 @@
                 <w:szCs w:val="21"/>
                 <w:shd w:fill="FFE97A" w:color="auto" w:val="clear"/>
               </w:rPr>
-              <w:t xml:space="preserve">Name, role (e.g. science teacher)</w:t>
+              <w:t xml:space="preserve">Name and role (confirm who this is)</w:t>
             </w:r>
           </w:p>
         </w:tc>
@@ -598,7 +689,7 @@
                 <w:sz w:val="20"/>
                 <w:szCs w:val="20"/>
               </w:rPr>
-              <w:t xml:space="preserve">Night Signal: Apnea Detector</w:t>
+              <w:t xml:space="preserve">Night Signal: SpO2 Accuracy (revised; original title was “Night Signal: Apnea Detector”)</w:t>
             </w:r>
           </w:p>
         </w:tc>
@@ -702,7 +793,7 @@
                 <w:sz w:val="20"/>
                 <w:szCs w:val="20"/>
               </w:rPr>
-              <w:t xml:space="preserve">After approval: October to December (before the January 11 final slides)</w:t>
+              <w:t xml:space="preserve">Only after scope approval, ethics approval and signed consent; target October to December (before the January 11 final slides)</w:t>
             </w:r>
           </w:p>
         </w:tc>
@@ -840,7 +931,7 @@
                 <w:sz w:val="19"/>
                 <w:szCs w:val="19"/>
               </w:rPr>
-              <w:t xml:space="preserve">Yes. Me (the exhibitor), plus up to 4 adult volunteers for one 30-minute awake test (optional).</w:t>
+              <w:t xml:space="preserve">Yes. Me (the exhibitor). Optionally up to 4 adult volunteers for one 30-minute seated accuracy session, only if Ms. Ireland and the ethics committee agree.</w:t>
             </w:r>
           </w:p>
         </w:tc>
@@ -1152,7 +1243,7 @@
                 <w:sz w:val="19"/>
                 <w:szCs w:val="19"/>
               </w:rPr>
-              <w:t xml:space="preserve">Short voluntary breath-holds (10 to 20 seconds) while seated, awake and supervised by an adult. Only the exhibitor does them.</w:t>
+              <w:t xml:space="preserve">Optional, only if approved: short voluntary breath-holds (20 seconds at most) by the exhibitor only, seated, awake and supervised by an adult.</w:t>
             </w:r>
           </w:p>
         </w:tc>
@@ -1204,7 +1295,7 @@
                 <w:sz w:val="19"/>
                 <w:szCs w:val="19"/>
               </w:rPr>
-              <w:t xml:space="preserve">No. It is an educational prototype. It is never used to diagnose or treat anyone.</w:t>
+              <w:t xml:space="preserve">No. It is an educational prototype. It cannot diagnose or confirm sleep apnea or any other condition, and is never used to treat anyone.</w:t>
             </w:r>
           </w:p>
         </w:tc>
@@ -1280,7 +1371,7 @@
           <w:sz w:val="21"/>
           <w:szCs w:val="21"/>
         </w:rPr>
-        <w:t xml:space="preserve">Sleep apnea is a disorder in which breathing stops repeatedly during sleep. This makes blood oxygen (SpO₂) dip and changes the heart rate. Most people who have it have never been tested, because a sleep-lab study is expensive and hard to get.</w:t>
+        <w:t xml:space="preserve">Pulse oximeters estimate blood oxygen saturation (SpO₂) by shining red and infrared light through the fingertip. A short drop in SpO₂ is called an oxygen desaturation. Desaturations can happen during sleep apnea, but they also have other causes (movement, poor sensor contact, other conditions), and not every apnea causes a large drop. Diagnosing sleep apnea requires a sleep study that also measures airflow, breathing effort and sleep.</w:t>
       </w:r>
     </w:p>
     <w:p>
@@ -1292,7 +1383,76 @@
           <w:sz w:val="21"/>
           <w:szCs w:val="21"/>
         </w:rPr>
-        <w:t xml:space="preserve">I built a low-cost wearable (well under $100 in parts) to see whether it can measure blood oxygen accurately enough to detect these dips. It uses an ESP32 microcontroller, a MAX30102 fingertip light sensor (the same type of sensor as in store-bought pulse oximeters) and an MPU-6050 motion sensor for sleeping position. It sends one reading per second by Bluetooth to a laptop, where my software detects oxygen dips and estimates events per hour.</w:t>
+        <w:t xml:space="preserve">This project builds a low-cost wearable from an ESP32 microcontroller and a MAX30102 fingertip light sensor (with an MPU-6050 motion sensor used to exclude readings taken during movement). It records SpO₂ and heart rate once per second. The project measures how closely these readings agree with a separate Health Canada-licensed fingertip pulse oximeter, and whether software can reliably flag oxygen desaturation events in the wearable's own recordings.</w:t>
+      </w:r>
+    </w:p>
+    <w:tbl>
+      <w:tblPr>
+        <w:tblW w:type="dxa" w:w="10080"/>
+        <w:tblBorders>
+          <w:top w:val="single" w:color="auto" w:sz="4"/>
+          <w:left w:val="single" w:color="auto" w:sz="4"/>
+          <w:bottom w:val="single" w:color="auto" w:sz="4"/>
+          <w:right w:val="single" w:color="auto" w:sz="4"/>
+          <w:insideH w:val="single" w:color="auto" w:sz="4"/>
+          <w:insideV w:val="single" w:color="auto" w:sz="4"/>
+        </w:tblBorders>
+      </w:tblPr>
+      <w:tblGrid>
+        <w:gridCol w:w="10080"/>
+      </w:tblGrid>
+      <w:tr>
+        <w:tc>
+          <w:tcPr>
+            <w:tcW w:type="dxa" w:w="10080"/>
+            <w:tcBorders>
+              <w:top w:val="none"/>
+              <w:left w:val="single" w:color="1F8A9C" w:sz="24"/>
+              <w:bottom w:val="none"/>
+              <w:right w:val="none"/>
+            </w:tcBorders>
+            <w:shd w:fill="EAF4F6" w:color="auto" w:val="clear"/>
+            <w:tcMar>
+              <w:top w:type="dxa" w:w="120"/>
+              <w:left w:type="dxa" w:w="180"/>
+              <w:bottom w:type="dxa" w:w="120"/>
+              <w:right w:type="dxa" w:w="180"/>
+            </w:tcMar>
+          </w:tcPr>
+          <w:p>
+            <w:pPr>
+              <w:spacing w:after="100" w:line="276"/>
+            </w:pPr>
+            <w:r>
+              <w:rPr>
+                <w:b/>
+                <w:bCs/>
+                <w:sz w:val="21"/>
+                <w:szCs w:val="21"/>
+              </w:rPr>
+              <w:t xml:space="preserve">What this project cannot do. </w:t>
+            </w:r>
+            <w:r>
+              <w:rPr>
+                <w:sz w:val="21"/>
+                <w:szCs w:val="21"/>
+              </w:rPr>
+              <w:t xml:space="preserve">It measures only oxygen and heart rate. It cannot detect, diagnose or confirm sleep apnea, and it does not calculate an apnea–hypopnea index (AHI). Any event rate is reported as flagged desaturation events per hour of valid recording.</w:t>
+            </w:r>
+          </w:p>
+        </w:tc>
+      </w:tr>
+    </w:tbl>
+    <w:p>
+      <w:pPr>
+        <w:spacing w:after="100" w:line="276"/>
+      </w:pPr>
+      <w:r>
+        <w:rPr>
+          <w:sz w:val="21"/>
+          <w:szCs w:val="21"/>
+        </w:rPr>
+        <w:t xml:space="preserve"/>
       </w:r>
     </w:p>
     <w:p>
@@ -1313,7 +1473,7 @@
           <w:sz w:val="21"/>
           <w:szCs w:val="21"/>
         </w:rPr>
-        <w:t xml:space="preserve">Can a low-cost wearable detect the oxygen drops linked to sleep apnea accurately enough to estimate how many events happen per hour?</w:t>
+        <w:t xml:space="preserve">How closely do SpO₂ and heart-rate readings from a low-cost wearable (MAX30102 + ESP32) agree with a Health Canada-licensed fingertip pulse oximeter, and can software reliably flag oxygen desaturation events (a drop of 3 percentage points or more lasting at least 10 seconds) in the wearable's recordings?</w:t>
       </w:r>
     </w:p>
     <w:p>
@@ -1334,7 +1494,7 @@
           <w:sz w:val="21"/>
           <w:szCs w:val="21"/>
         </w:rPr>
-        <w:t xml:space="preserve">If the wearable measures oxygen and heart rate every second, then software can detect desaturation events and count them per hour, because breathing pauses produce measurable oxygen dips.</w:t>
+        <w:t xml:space="preserve">If the wearable is worn correctly and only good-quality readings are used, then its SpO₂ will agree with the reference oximeter within about ±3 percentage points (95% limits of agreement), because both measure red/infrared light absorption, and the software will flag the dips that the reference also shows.</w:t>
       </w:r>
     </w:p>
     <w:p>
@@ -1343,7 +1503,7 @@
         <w:spacing w:after="120" w:before="240"/>
       </w:pPr>
       <w:r>
-        <w:t xml:space="preserve">3. Research protocol</w:t>
+        <w:t xml:space="preserve">3. Research protocol (planned; nothing has been carried out yet)</w:t>
       </w:r>
     </w:p>
     <w:p>
@@ -1531,7 +1691,7 @@
                 <w:sz w:val="19"/>
                 <w:szCs w:val="19"/>
               </w:rPr>
-              <w:t xml:space="preserve">All tests: accuracy test, breath-hold test, recorded nights. Parent/guardian consent.</w:t>
+              <w:t xml:space="preserve">Accuracy sessions; if approved, the optional breath-hold test and overnight recordings. Parent/guardian consent required.</w:t>
             </w:r>
           </w:p>
         </w:tc>
@@ -1583,7 +1743,7 @@
                 <w:sz w:val="19"/>
                 <w:szCs w:val="19"/>
               </w:rPr>
-              <w:t xml:space="preserve">Up to 4 adult volunteers (18+), e.g. family members. Optional.</w:t>
+              <w:t xml:space="preserve">Optional: up to 4 adult volunteers (18+), e.g. family members, only if approved.</w:t>
             </w:r>
           </w:p>
         </w:tc>
@@ -1608,7 +1768,7 @@
                 <w:sz w:val="19"/>
                 <w:szCs w:val="19"/>
               </w:rPr>
-              <w:t xml:space="preserve">Accuracy test only (30 min, seated, awake). No breath-holds, no nights.</w:t>
+              <w:t xml:space="preserve">Accuracy session only (30 min, seated, awake). No breath-holds, no nights.</w:t>
             </w:r>
           </w:p>
         </w:tc>
@@ -1708,7 +1868,24 @@
           <w:sz w:val="21"/>
           <w:szCs w:val="21"/>
         </w:rPr>
-        <w:t xml:space="preserve">Reference: Elite Medica fingertip pulse oximeter (Health Canada authorized).</w:t>
+        <w:t xml:space="preserve">Reference: a fingertip pulse oximeter with a Health Canada medical device licence (</w:t>
+      </w:r>
+      <w:r>
+        <w:rPr>
+          <w:b/>
+          <w:bCs/>
+          <w:sz w:val="21"/>
+          <w:szCs w:val="21"/>
+          <w:shd w:fill="FFE97A" w:color="auto" w:val="clear"/>
+        </w:rPr>
+        <w:t xml:space="preserve">model and licence number to confirm</w:t>
+      </w:r>
+      <w:r>
+        <w:rPr>
+          <w:sz w:val="21"/>
+          <w:szCs w:val="21"/>
+        </w:rPr>
+        <w:t xml:space="preserve">). Its stated accuracy is about ±2 percentage points, so the comparison measures agreement between two devices, not absolute truth.</w:t>
       </w:r>
     </w:p>
     <w:p>
@@ -1748,14 +1925,14 @@
           <w:sz w:val="21"/>
           <w:szCs w:val="21"/>
         </w:rPr>
-        <w:t xml:space="preserve">A. Device check (no participant risk). </w:t>
+        <w:t xml:space="preserve">A. Device check (no participant). </w:t>
       </w:r>
       <w:r>
         <w:rPr>
           <w:sz w:val="21"/>
           <w:szCs w:val="21"/>
         </w:rPr>
-        <w:t xml:space="preserve">Before every session I run check_device.py, which confirms that data arrives every second, both sensors pass their self-test and readings are in a normal range. The session continues only if the device is READY.</w:t>
+        <w:t xml:space="preserve">Before every session I run check_device.py, which confirms that data arrives every second, both sensors pass their self-test and readings are in a normal range. The session continues only if the device reports READY.</w:t>
       </w:r>
     </w:p>
     <w:p>
@@ -1769,14 +1946,14 @@
           <w:sz w:val="21"/>
           <w:szCs w:val="21"/>
         </w:rPr>
-        <w:t xml:space="preserve">B. Accuracy test (P1 and volunteers, about 35 min). </w:t>
+        <w:t xml:space="preserve">B. Accuracy sessions: the main test (P1, and volunteers if approved; about 35 min each). </w:t>
       </w:r>
       <w:r>
         <w:rPr>
           <w:sz w:val="21"/>
           <w:szCs w:val="21"/>
         </w:rPr>
-        <w:t xml:space="preserve">The participant sits and rests for 5 minutes. They wear the wearable on one index finger and the reference oximeter on the other hand. Every 2 minutes for 30 minutes, I write down both readings on sheet A. They breathe normally the whole time.</w:t>
+        <w:t xml:space="preserve">The participant sits and rests for 5 minutes with warm hands. They wear the wearable on one index finger and the reference oximeter on the other hand. Every 2 minutes for 30 minutes, I write down the time and both devices' SpO₂ and pulse on sheet A (15 pairs per session). They breathe normally throughout. P1 repeats this on several different days.</w:t>
       </w:r>
     </w:p>
     <w:p>
@@ -1790,14 +1967,51 @@
           <w:sz w:val="21"/>
           <w:szCs w:val="21"/>
         </w:rPr>
-        <w:t xml:space="preserve">C. Breath-hold test (P1 only, about 45 min, adult supervisor present). </w:t>
+        <w:t xml:space="preserve">C. Signal-quality checks (data processing, no participant). </w:t>
       </w:r>
       <w:r>
         <w:rPr>
           <w:sz w:val="21"/>
           <w:szCs w:val="21"/>
         </w:rPr>
-        <w:t xml:space="preserve">Seated and awake, after 2 minutes of normal breathing, I do short voluntary breath-holds after a normal breath out: 5 each of 10, 15 and 20 seconds, with at least 2 minutes of normal breathing between holds. The supervisor times them and logs the start and end of each hold on sheet B. These times are the known events used to score the software. Rules:</w:t>
+        <w:t xml:space="preserve">A one-second reading is used only if a finger is detected, the sensor marks the reading valid, SpO₂ is between 70 and 100%, and there was no sudden movement within 5 seconds. Each report states the percentage of valid signal. Agreement is calculated as bias, 95% limits of agreement and mean absolute difference (Bland–Altman method).</w:t>
+      </w:r>
+    </w:p>
+    <w:p>
+      <w:pPr>
+        <w:spacing w:after="100" w:line="276"/>
+      </w:pPr>
+      <w:r>
+        <w:rPr>
+          <w:b/>
+          <w:bCs/>
+          <w:sz w:val="21"/>
+          <w:szCs w:val="21"/>
+        </w:rPr>
+        <w:t xml:space="preserve">D. Breath-hold test (optional; P1 only; only if approved; about 45 min; adult supervisor present). </w:t>
+      </w:r>
+      <w:r>
+        <w:rPr>
+          <w:sz w:val="21"/>
+          <w:szCs w:val="21"/>
+        </w:rPr>
+        <w:t xml:space="preserve">Seated and awake, after 2 minutes of normal breathing, I do short voluntary breath-holds: up to 5 each of 10, 15 and 20 seconds, with at least 2 minutes of normal breathing between holds. The supervisor times them and logs the start and end of each hold on sheet B. </w:t>
+      </w:r>
+      <w:r>
+        <w:rPr>
+          <w:b/>
+          <w:bCs/>
+          <w:sz w:val="21"/>
+          <w:szCs w:val="21"/>
+        </w:rPr>
+        <w:t xml:space="preserve">Purpose and limit: </w:t>
+      </w:r>
+      <w:r>
+        <w:rPr>
+          <w:sz w:val="21"/>
+          <w:szCs w:val="21"/>
+        </w:rPr>
+        <w:t xml:space="preserve">this only checks whether the software flags short, deliberately induced dips at the logged times. An awake breath-hold is not a sleep apnea, so this test does not validate detecting sleep apnea during sleep. Short holds may not lower SpO₂ by 3 points; if so, that is reported, and holds are never made longer. Rules:</w:t>
       </w:r>
     </w:p>
     <w:p>
@@ -1845,14 +2059,14 @@
           <w:sz w:val="21"/>
           <w:szCs w:val="21"/>
         </w:rPr>
-        <w:t xml:space="preserve">D. Recorded nights (P1 only, at least 5 nights at home). </w:t>
+        <w:t xml:space="preserve">E. Overnight recordings (optional; P1 only; only if approved; up to 5 nights at home). </w:t>
       </w:r>
       <w:r>
         <w:rPr>
           <w:sz w:val="21"/>
           <w:szCs w:val="21"/>
         </w:rPr>
-        <w:t xml:space="preserve">I wear the cuff on my index finger and the armband pouch on my forearm during my normal sleep. Nothing about my sleep is changed. The USB cable runs along my arm to the side of the bed, never near the neck, and is clipped to the mattress. I can take it off at any time. Each morning I fill in sheet C and the comfort check (sheet D).</w:t>
+        <w:t xml:space="preserve">I wear the cuff on my index finger and the armband pouch on my forearm during my normal sleep. Nothing about my sleep is changed. The USB cable runs along my arm to the side of the bed, never near the neck, and is clipped to the mattress. I can take it off at any time. Each morning I fill in sheet C and the comfort check (sheet D). These recordings measure only the percentage of valid signal and the number of flagged desaturation events per hour of valid recording; because the reference oximeter does not record overnight, these events cannot be verified, and they are not interpreted as apneas.</w:t>
       </w:r>
     </w:p>
     <w:p>
@@ -1878,7 +2092,7 @@
           <w:sz w:val="21"/>
           <w:szCs w:val="21"/>
         </w:rPr>
-        <w:t xml:space="preserve">Recorded: blood oxygen (%), heart rate, motion (sleeping position), finger-contact flag and the time. No names, photos of faces or other personal information.</w:t>
+        <w:t xml:space="preserve">Recorded: blood oxygen (%), heart rate, motion (used to exclude readings during movement), finger-contact flag and the time. No names, photos of faces or other personal information.</w:t>
       </w:r>
     </w:p>
     <w:p>
@@ -1950,7 +2164,7 @@
           <w:sz w:val="21"/>
           <w:szCs w:val="21"/>
         </w:rPr>
-        <w:t xml:space="preserve">The wearable is an educational prototype and I do not interpret anyone's health. If the reference oximeter shows a resting value below 92%, the test stops and the participant (and parent/guardian for a minor) is advised to speak to a doctor. If my own night recordings show many oxygen dips, I will tell my parents, and we will treat it only as a reason to ask a doctor, never as a diagnosis.</w:t>
+        <w:t xml:space="preserve">The wearable is an educational prototype and I do not interpret anyone's health. If the reference oximeter shows a resting value below 92%, the session stops and the participant (and parent/guardian for a minor) is advised to speak to a doctor. If my own night recordings show many oxygen dips, I will tell my parents. The device cannot say whether anyone has sleep apnea; at most, such a result is a reason to ask a doctor.</w:t>
       </w:r>
     </w:p>
     <w:p>
@@ -2144,7 +2358,7 @@
                 <w:sz w:val="18"/>
                 <w:szCs w:val="18"/>
               </w:rPr>
-              <w:t xml:space="preserve">Light-headedness during breath-holds</w:t>
+              <w:t xml:space="preserve">Light-headedness during breath-holds (optional test)</w:t>
             </w:r>
           </w:p>
         </w:tc>
@@ -2244,7 +2458,7 @@
                 <w:sz w:val="18"/>
                 <w:szCs w:val="18"/>
               </w:rPr>
-              <w:t xml:space="preserve">Holds of 20 s or less, seated, 2 min rest between holds, adult present, stop at any discomfort, stop the session below 90% on the reference oximeter. Never while asleep.</w:t>
+              <w:t xml:space="preserve">Only if approved. Holds of 20 s or less, seated, 2 min rest between holds, adult present, stop at any discomfort, stop the session below 90% on the reference oximeter. Never while asleep.</w:t>
             </w:r>
           </w:p>
         </w:tc>
@@ -2525,7 +2739,7 @@
                 <w:sz w:val="18"/>
                 <w:szCs w:val="18"/>
               </w:rPr>
-              <w:t xml:space="preserve">Cable at night (tangling or tripping)</w:t>
+              <w:t xml:space="preserve">Cable at night (tangling or tripping; optional nights)</w:t>
             </w:r>
           </w:p>
         </w:tc>
@@ -2652,7 +2866,7 @@
                 <w:sz w:val="18"/>
                 <w:szCs w:val="18"/>
               </w:rPr>
-              <w:t xml:space="preserve">Poor sleep or discomfort</w:t>
+              <w:t xml:space="preserve">Poor sleep or discomfort (optional nights)</w:t>
             </w:r>
           </w:p>
         </w:tc>
@@ -3033,7 +3247,7 @@
                 <w:sz w:val="18"/>
                 <w:szCs w:val="18"/>
               </w:rPr>
-              <w:t xml:space="preserve">Worry about a result</w:t>
+              <w:t xml:space="preserve">Worry or false reassurance about a result</w:t>
             </w:r>
           </w:p>
         </w:tc>
@@ -3133,7 +3347,7 @@
                 <w:sz w:val="18"/>
                 <w:szCs w:val="18"/>
               </w:rPr>
-              <w:t xml:space="preserve">It is explained beforehand that this is not a medical test. Unusual readings mean seeing a doctor, not a diagnosis.</w:t>
+              <w:t xml:space="preserve">It is explained beforehand that this is not a medical test and cannot detect or rule out sleep apnea. Unusual readings mean seeing a doctor, not a diagnosis.</w:t>
             </w:r>
           </w:p>
         </w:tc>
@@ -3202,7 +3416,7 @@
                 <w:sz w:val="21"/>
                 <w:szCs w:val="21"/>
               </w:rPr>
-              <w:t xml:space="preserve">The risks are no greater than everyday life. Wearing a fingertip light sensor is what a pharmacy pulse oximeter does, and a 20-second breath-hold is shorter than holding your breath underwater at a pool.</w:t>
+              <w:t xml:space="preserve">The main test is sitting still with two fingertip sensors, which is what a pharmacy pulse oximeter does. The optional breath-hold test is limited to 20 seconds, seated and supervised, and happens only if approved.</w:t>
             </w:r>
           </w:p>
         </w:tc>
@@ -3265,7 +3479,7 @@
                 <w:sz w:val="21"/>
                 <w:szCs w:val="21"/>
               </w:rPr>
-              <w:t xml:space="preserve">If Technoscience's Certificate of Approval is used as the consent form, give this page to each participant to read before they sign it. Keep this version as well for the parent/guardian signature for a minor.</w:t>
+              <w:t xml:space="preserve">Draft for review. If Technoscience's Certificate of Approval is used as the consent form, give this page to each participant to read before they sign it. Keep this version as well for the parent/guardian signature for a minor. No one should sign until the project has been approved.</w:t>
             </w:r>
           </w:p>
         </w:tc>
@@ -3301,7 +3515,7 @@
           <w:sz w:val="21"/>
           <w:szCs w:val="21"/>
         </w:rPr>
-        <w:t xml:space="preserve">Night Signal, a low-cost wearable to detect the oxygen dips linked to sleep apnea. Science fair project by Gabriel Mamane.</w:t>
+        <w:t xml:space="preserve">Night Signal, a science fair project by Gabriel Mamane that tests how closely a low-cost fingertip sensor measures blood oxygen and pulse compared with a store-bought pulse oximeter.</w:t>
       </w:r>
     </w:p>
     <w:p>
@@ -3322,7 +3536,7 @@
           <w:sz w:val="21"/>
           <w:szCs w:val="21"/>
         </w:rPr>
-        <w:t xml:space="preserve">sit and rest for about 35 minutes while wearing a soft fingertip sensor on one hand and a store-bought pulse oximeter on the other. Every 2 minutes, both readings are written down. (The breath-hold test and the night recordings are done only by the student.)</w:t>
+        <w:t xml:space="preserve">sit and rest for about 35 minutes while wearing a soft fingertip sensor on one hand and a store-bought pulse oximeter on the other. Every 2 minutes, both readings are written down. (The optional breath-hold test and night recordings are done only by the student, and only if approved.)</w:t>
       </w:r>
     </w:p>
     <w:p>
@@ -3364,7 +3578,7 @@
           <w:sz w:val="21"/>
           <w:szCs w:val="21"/>
         </w:rPr>
-        <w:t xml:space="preserve">none directly for you. You help test whether low-cost devices could one day make sleep apnea screening easier.</w:t>
+        <w:t xml:space="preserve">none directly for you. You help measure how accurate a low-cost oxygen sensor is.</w:t>
       </w:r>
     </w:p>
     <w:p>
@@ -3427,7 +3641,7 @@
           <w:sz w:val="21"/>
           <w:szCs w:val="21"/>
         </w:rPr>
-        <w:t xml:space="preserve">this is a student prototype. It cannot tell you anything about your health. If the store-bought oximeter shows an unusual value, you will be advised to talk to a doctor.</w:t>
+        <w:t xml:space="preserve">this is a student prototype. It cannot tell you anything about your health and cannot detect or rule out sleep apnea. If the store-bought oximeter shows an unusual value, you will be advised to talk to a doctor.</w:t>
       </w:r>
     </w:p>
     <w:p>
@@ -3597,7 +3811,7 @@
         <w:spacing w:after="80" w:before="200"/>
       </w:pPr>
       <w:r>
-        <w:t xml:space="preserve">Sheet A: Accuracy test</w:t>
+        <w:t xml:space="preserve">Sheet A: Accuracy session</w:t>
       </w:r>
     </w:p>
     <w:p>
@@ -3609,7 +3823,7 @@
           <w:sz w:val="19"/>
           <w:szCs w:val="19"/>
         </w:rPr>
-        <w:t xml:space="preserve">Participant code ____   Date ____________   Start time ______   Room temperature ____ °C   Wearable on: L / R index finger</w:t>
+        <w:t xml:space="preserve">Participant code ____   Session # ____   Date ____________   Start time ______   Room temperature ____ °C   Wearable on: L / R index finger   Device check READY? Y / N</w:t>
       </w:r>
     </w:p>
     <w:tbl>
@@ -3823,7 +4037,7 @@
                 <w:sz w:val="18"/>
                 <w:szCs w:val="18"/>
               </w:rPr>
-              <w:t xml:space="preserve">Notes</w:t>
+              <w:t xml:space="preserve">Notes (movement, cold hands…)</w:t>
             </w:r>
           </w:p>
         </w:tc>
@@ -6720,7 +6934,7 @@
         <w:spacing w:after="80" w:before="200"/>
       </w:pPr>
       <w:r>
-        <w:t xml:space="preserve">Sheet B: Breath-hold test (P1 only, supervised)</w:t>
+        <w:t xml:space="preserve">Sheet B: Breath-hold test (optional; P1 only; only if approved; supervised)</w:t>
       </w:r>
     </w:p>
     <w:p>
@@ -9676,7 +9890,7 @@
           <w:sz w:val="19"/>
           <w:szCs w:val="19"/>
         </w:rPr>
-        <w:t xml:space="preserve">Stop rules: stop immediately at any dizziness, discomfort or tingling. Stop the session if the reference oximeter reads below 90%. Hold for 20 seconds at most. Always seated.</w:t>
+        <w:t xml:space="preserve">Stop rules: stop immediately at any dizziness, discomfort or tingling. Stop the session if the reference oximeter reads below 90%. Hold for 20 seconds at most. Always seated. This test checks dip flagging only; it is not a test of sleep apnea.</w:t>
       </w:r>
     </w:p>
     <w:p>
@@ -9685,7 +9899,7 @@
         <w:spacing w:after="80" w:before="200"/>
       </w:pPr>
       <w:r>
-        <w:t xml:space="preserve">Sheet C: Night log (P1 only)</w:t>
+        <w:t xml:space="preserve">Sheet C: Night log (optional; P1 only; only if approved)</w:t>
       </w:r>
     </w:p>
     <w:tbl>
@@ -10778,416 +10992,6 @@
                 <w:szCs w:val="18"/>
               </w:rPr>
               <w:t xml:space="preserve">5</w:t>
-            </w:r>
-          </w:p>
-        </w:tc>
-        <w:tc>
-          <w:tcPr>
-            <w:tcW w:type="dxa" w:w="1300"/>
-            <w:tcMar>
-              <w:top w:type="dxa" w:w="60"/>
-              <w:left w:type="dxa" w:w="100"/>
-              <w:bottom w:type="dxa" w:w="60"/>
-              <w:right w:type="dxa" w:w="100"/>
-            </w:tcMar>
-          </w:tcPr>
-          <w:p>
-            <w:pPr>
-              <w:spacing w:after="0" w:line="252"/>
-            </w:pPr>
-            <w:r>
-              <w:rPr>
-                <w:b w:val="false"/>
-                <w:bCs w:val="false"/>
-                <w:sz w:val="18"/>
-                <w:szCs w:val="18"/>
-              </w:rPr>
-              <w:t xml:space="preserve"/>
-            </w:r>
-          </w:p>
-        </w:tc>
-        <w:tc>
-          <w:tcPr>
-            <w:tcW w:type="dxa" w:w="1200"/>
-            <w:tcMar>
-              <w:top w:type="dxa" w:w="60"/>
-              <w:left w:type="dxa" w:w="100"/>
-              <w:bottom w:type="dxa" w:w="60"/>
-              <w:right w:type="dxa" w:w="100"/>
-            </w:tcMar>
-          </w:tcPr>
-          <w:p>
-            <w:pPr>
-              <w:spacing w:after="0" w:line="252"/>
-            </w:pPr>
-            <w:r>
-              <w:rPr>
-                <w:b w:val="false"/>
-                <w:bCs w:val="false"/>
-                <w:sz w:val="18"/>
-                <w:szCs w:val="18"/>
-              </w:rPr>
-              <w:t xml:space="preserve"/>
-            </w:r>
-          </w:p>
-        </w:tc>
-        <w:tc>
-          <w:tcPr>
-            <w:tcW w:type="dxa" w:w="1200"/>
-            <w:tcMar>
-              <w:top w:type="dxa" w:w="60"/>
-              <w:left w:type="dxa" w:w="100"/>
-              <w:bottom w:type="dxa" w:w="60"/>
-              <w:right w:type="dxa" w:w="100"/>
-            </w:tcMar>
-          </w:tcPr>
-          <w:p>
-            <w:pPr>
-              <w:spacing w:after="0" w:line="252"/>
-            </w:pPr>
-            <w:r>
-              <w:rPr>
-                <w:b w:val="false"/>
-                <w:bCs w:val="false"/>
-                <w:sz w:val="18"/>
-                <w:szCs w:val="18"/>
-              </w:rPr>
-              <w:t xml:space="preserve"/>
-            </w:r>
-          </w:p>
-        </w:tc>
-        <w:tc>
-          <w:tcPr>
-            <w:tcW w:type="dxa" w:w="1500"/>
-            <w:tcMar>
-              <w:top w:type="dxa" w:w="60"/>
-              <w:left w:type="dxa" w:w="100"/>
-              <w:bottom w:type="dxa" w:w="60"/>
-              <w:right w:type="dxa" w:w="100"/>
-            </w:tcMar>
-          </w:tcPr>
-          <w:p>
-            <w:pPr>
-              <w:spacing w:after="0" w:line="252"/>
-            </w:pPr>
-            <w:r>
-              <w:rPr>
-                <w:b w:val="false"/>
-                <w:bCs w:val="false"/>
-                <w:sz w:val="18"/>
-                <w:szCs w:val="18"/>
-              </w:rPr>
-              <w:t xml:space="preserve"/>
-            </w:r>
-          </w:p>
-        </w:tc>
-        <w:tc>
-          <w:tcPr>
-            <w:tcW w:type="dxa" w:w="1500"/>
-            <w:tcMar>
-              <w:top w:type="dxa" w:w="60"/>
-              <w:left w:type="dxa" w:w="100"/>
-              <w:bottom w:type="dxa" w:w="60"/>
-              <w:right w:type="dxa" w:w="100"/>
-            </w:tcMar>
-          </w:tcPr>
-          <w:p>
-            <w:pPr>
-              <w:spacing w:after="0" w:line="252"/>
-            </w:pPr>
-            <w:r>
-              <w:rPr>
-                <w:b w:val="false"/>
-                <w:bCs w:val="false"/>
-                <w:sz w:val="18"/>
-                <w:szCs w:val="18"/>
-              </w:rPr>
-              <w:t xml:space="preserve"/>
-            </w:r>
-          </w:p>
-        </w:tc>
-        <w:tc>
-          <w:tcPr>
-            <w:tcW w:type="dxa" w:w="1100"/>
-            <w:tcMar>
-              <w:top w:type="dxa" w:w="60"/>
-              <w:left w:type="dxa" w:w="100"/>
-              <w:bottom w:type="dxa" w:w="60"/>
-              <w:right w:type="dxa" w:w="100"/>
-            </w:tcMar>
-          </w:tcPr>
-          <w:p>
-            <w:pPr>
-              <w:spacing w:after="0" w:line="252"/>
-            </w:pPr>
-            <w:r>
-              <w:rPr>
-                <w:b w:val="false"/>
-                <w:bCs w:val="false"/>
-                <w:sz w:val="18"/>
-                <w:szCs w:val="18"/>
-              </w:rPr>
-              <w:t xml:space="preserve"/>
-            </w:r>
-          </w:p>
-        </w:tc>
-        <w:tc>
-          <w:tcPr>
-            <w:tcW w:type="dxa" w:w="1380"/>
-            <w:tcMar>
-              <w:top w:type="dxa" w:w="60"/>
-              <w:left w:type="dxa" w:w="100"/>
-              <w:bottom w:type="dxa" w:w="60"/>
-              <w:right w:type="dxa" w:w="100"/>
-            </w:tcMar>
-          </w:tcPr>
-          <w:p>
-            <w:pPr>
-              <w:spacing w:after="0" w:line="252"/>
-            </w:pPr>
-            <w:r>
-              <w:rPr>
-                <w:b w:val="false"/>
-                <w:bCs w:val="false"/>
-                <w:sz w:val="18"/>
-                <w:szCs w:val="18"/>
-              </w:rPr>
-              <w:t xml:space="preserve"/>
-            </w:r>
-          </w:p>
-        </w:tc>
-      </w:tr>
-      <w:tr>
-        <w:trPr>
-          <w:trHeight w:val="420" w:hRule="atLeast"/>
-        </w:trPr>
-        <w:tc>
-          <w:tcPr>
-            <w:tcW w:type="dxa" w:w="900"/>
-            <w:tcMar>
-              <w:top w:type="dxa" w:w="60"/>
-              <w:left w:type="dxa" w:w="100"/>
-              <w:bottom w:type="dxa" w:w="60"/>
-              <w:right w:type="dxa" w:w="100"/>
-            </w:tcMar>
-          </w:tcPr>
-          <w:p>
-            <w:pPr>
-              <w:spacing w:after="0" w:line="252"/>
-            </w:pPr>
-            <w:r>
-              <w:rPr>
-                <w:b w:val="false"/>
-                <w:bCs w:val="false"/>
-                <w:sz w:val="18"/>
-                <w:szCs w:val="18"/>
-              </w:rPr>
-              <w:t xml:space="preserve">6</w:t>
-            </w:r>
-          </w:p>
-        </w:tc>
-        <w:tc>
-          <w:tcPr>
-            <w:tcW w:type="dxa" w:w="1300"/>
-            <w:tcMar>
-              <w:top w:type="dxa" w:w="60"/>
-              <w:left w:type="dxa" w:w="100"/>
-              <w:bottom w:type="dxa" w:w="60"/>
-              <w:right w:type="dxa" w:w="100"/>
-            </w:tcMar>
-          </w:tcPr>
-          <w:p>
-            <w:pPr>
-              <w:spacing w:after="0" w:line="252"/>
-            </w:pPr>
-            <w:r>
-              <w:rPr>
-                <w:b w:val="false"/>
-                <w:bCs w:val="false"/>
-                <w:sz w:val="18"/>
-                <w:szCs w:val="18"/>
-              </w:rPr>
-              <w:t xml:space="preserve"/>
-            </w:r>
-          </w:p>
-        </w:tc>
-        <w:tc>
-          <w:tcPr>
-            <w:tcW w:type="dxa" w:w="1200"/>
-            <w:tcMar>
-              <w:top w:type="dxa" w:w="60"/>
-              <w:left w:type="dxa" w:w="100"/>
-              <w:bottom w:type="dxa" w:w="60"/>
-              <w:right w:type="dxa" w:w="100"/>
-            </w:tcMar>
-          </w:tcPr>
-          <w:p>
-            <w:pPr>
-              <w:spacing w:after="0" w:line="252"/>
-            </w:pPr>
-            <w:r>
-              <w:rPr>
-                <w:b w:val="false"/>
-                <w:bCs w:val="false"/>
-                <w:sz w:val="18"/>
-                <w:szCs w:val="18"/>
-              </w:rPr>
-              <w:t xml:space="preserve"/>
-            </w:r>
-          </w:p>
-        </w:tc>
-        <w:tc>
-          <w:tcPr>
-            <w:tcW w:type="dxa" w:w="1200"/>
-            <w:tcMar>
-              <w:top w:type="dxa" w:w="60"/>
-              <w:left w:type="dxa" w:w="100"/>
-              <w:bottom w:type="dxa" w:w="60"/>
-              <w:right w:type="dxa" w:w="100"/>
-            </w:tcMar>
-          </w:tcPr>
-          <w:p>
-            <w:pPr>
-              <w:spacing w:after="0" w:line="252"/>
-            </w:pPr>
-            <w:r>
-              <w:rPr>
-                <w:b w:val="false"/>
-                <w:bCs w:val="false"/>
-                <w:sz w:val="18"/>
-                <w:szCs w:val="18"/>
-              </w:rPr>
-              <w:t xml:space="preserve"/>
-            </w:r>
-          </w:p>
-        </w:tc>
-        <w:tc>
-          <w:tcPr>
-            <w:tcW w:type="dxa" w:w="1500"/>
-            <w:tcMar>
-              <w:top w:type="dxa" w:w="60"/>
-              <w:left w:type="dxa" w:w="100"/>
-              <w:bottom w:type="dxa" w:w="60"/>
-              <w:right w:type="dxa" w:w="100"/>
-            </w:tcMar>
-          </w:tcPr>
-          <w:p>
-            <w:pPr>
-              <w:spacing w:after="0" w:line="252"/>
-            </w:pPr>
-            <w:r>
-              <w:rPr>
-                <w:b w:val="false"/>
-                <w:bCs w:val="false"/>
-                <w:sz w:val="18"/>
-                <w:szCs w:val="18"/>
-              </w:rPr>
-              <w:t xml:space="preserve"/>
-            </w:r>
-          </w:p>
-        </w:tc>
-        <w:tc>
-          <w:tcPr>
-            <w:tcW w:type="dxa" w:w="1500"/>
-            <w:tcMar>
-              <w:top w:type="dxa" w:w="60"/>
-              <w:left w:type="dxa" w:w="100"/>
-              <w:bottom w:type="dxa" w:w="60"/>
-              <w:right w:type="dxa" w:w="100"/>
-            </w:tcMar>
-          </w:tcPr>
-          <w:p>
-            <w:pPr>
-              <w:spacing w:after="0" w:line="252"/>
-            </w:pPr>
-            <w:r>
-              <w:rPr>
-                <w:b w:val="false"/>
-                <w:bCs w:val="false"/>
-                <w:sz w:val="18"/>
-                <w:szCs w:val="18"/>
-              </w:rPr>
-              <w:t xml:space="preserve"/>
-            </w:r>
-          </w:p>
-        </w:tc>
-        <w:tc>
-          <w:tcPr>
-            <w:tcW w:type="dxa" w:w="1100"/>
-            <w:tcMar>
-              <w:top w:type="dxa" w:w="60"/>
-              <w:left w:type="dxa" w:w="100"/>
-              <w:bottom w:type="dxa" w:w="60"/>
-              <w:right w:type="dxa" w:w="100"/>
-            </w:tcMar>
-          </w:tcPr>
-          <w:p>
-            <w:pPr>
-              <w:spacing w:after="0" w:line="252"/>
-            </w:pPr>
-            <w:r>
-              <w:rPr>
-                <w:b w:val="false"/>
-                <w:bCs w:val="false"/>
-                <w:sz w:val="18"/>
-                <w:szCs w:val="18"/>
-              </w:rPr>
-              <w:t xml:space="preserve"/>
-            </w:r>
-          </w:p>
-        </w:tc>
-        <w:tc>
-          <w:tcPr>
-            <w:tcW w:type="dxa" w:w="1380"/>
-            <w:tcMar>
-              <w:top w:type="dxa" w:w="60"/>
-              <w:left w:type="dxa" w:w="100"/>
-              <w:bottom w:type="dxa" w:w="60"/>
-              <w:right w:type="dxa" w:w="100"/>
-            </w:tcMar>
-          </w:tcPr>
-          <w:p>
-            <w:pPr>
-              <w:spacing w:after="0" w:line="252"/>
-            </w:pPr>
-            <w:r>
-              <w:rPr>
-                <w:b w:val="false"/>
-                <w:bCs w:val="false"/>
-                <w:sz w:val="18"/>
-                <w:szCs w:val="18"/>
-              </w:rPr>
-              <w:t xml:space="preserve"/>
-            </w:r>
-          </w:p>
-        </w:tc>
-      </w:tr>
-      <w:tr>
-        <w:trPr>
-          <w:trHeight w:val="420" w:hRule="atLeast"/>
-        </w:trPr>
-        <w:tc>
-          <w:tcPr>
-            <w:tcW w:type="dxa" w:w="900"/>
-            <w:tcMar>
-              <w:top w:type="dxa" w:w="60"/>
-              <w:left w:type="dxa" w:w="100"/>
-              <w:bottom w:type="dxa" w:w="60"/>
-              <w:right w:type="dxa" w:w="100"/>
-            </w:tcMar>
-          </w:tcPr>
-          <w:p>
-            <w:pPr>
-              <w:spacing w:after="0" w:line="252"/>
-            </w:pPr>
-            <w:r>
-              <w:rPr>
-                <w:b w:val="false"/>
-                <w:bCs w:val="false"/>
-                <w:sz w:val="18"/>
-                <w:szCs w:val="18"/>
-              </w:rPr>
-              <w:t xml:space="preserve">7</w:t>
             </w:r>
           </w:p>
         </w:tc>
@@ -12870,7 +12674,7 @@
         <w:sz w:val="16"/>
         <w:szCs w:val="16"/>
       </w:rPr>
-      <w:t xml:space="preserve">Night Signal · ethics package · page </w:t>
+      <w:t xml:space="preserve">Night Signal · ethics package (revised scope, draft for review) · page </w:t>
     </w:r>
     <w:r>
       <w:rPr>

</xml_diff>

<commit_message>
Fix ethics package page layout; add PDF copy
Start the risk assessment and the night-log sheet on new pages so no
table or summary box is stranded on a near-empty page.

Co-Authored-By: Claude Opus 5.5 <noreply@anthropic.com>
Claude-Session: https://claude.ai/code/session_01CxrUMy4UZKTNYh6kiz9919
</commit_message>
<xml_diff>
--- a/science-fair/night-signal/Night_Signal_Ethics.docx
+++ b/science-fair/night-signal/Night_Signal_Ethics.docx
@@ -2168,12 +2168,86 @@
       </w:r>
     </w:p>
     <w:p>
+      <w:r>
+        <w:br w:type="page"/>
+      </w:r>
+    </w:p>
+    <w:p>
       <w:pPr>
         <w:pStyle w:val="Heading1"/>
         <w:spacing w:after="120" w:before="240"/>
       </w:pPr>
       <w:r>
         <w:t xml:space="preserve">4. Risk assessment</w:t>
+      </w:r>
+    </w:p>
+    <w:tbl>
+      <w:tblPr>
+        <w:tblW w:type="dxa" w:w="10080"/>
+        <w:tblBorders>
+          <w:top w:val="single" w:color="auto" w:sz="4"/>
+          <w:left w:val="single" w:color="auto" w:sz="4"/>
+          <w:bottom w:val="single" w:color="auto" w:sz="4"/>
+          <w:right w:val="single" w:color="auto" w:sz="4"/>
+          <w:insideH w:val="single" w:color="auto" w:sz="4"/>
+          <w:insideV w:val="single" w:color="auto" w:sz="4"/>
+        </w:tblBorders>
+      </w:tblPr>
+      <w:tblGrid>
+        <w:gridCol w:w="10080"/>
+      </w:tblGrid>
+      <w:tr>
+        <w:tc>
+          <w:tcPr>
+            <w:tcW w:type="dxa" w:w="10080"/>
+            <w:tcBorders>
+              <w:top w:val="none"/>
+              <w:left w:val="single" w:color="1F8A9C" w:sz="24"/>
+              <w:bottom w:val="none"/>
+              <w:right w:val="none"/>
+            </w:tcBorders>
+            <w:shd w:fill="EAF4F6" w:color="auto" w:val="clear"/>
+            <w:tcMar>
+              <w:top w:type="dxa" w:w="120"/>
+              <w:left w:type="dxa" w:w="180"/>
+              <w:bottom w:type="dxa" w:w="120"/>
+              <w:right w:type="dxa" w:w="180"/>
+            </w:tcMar>
+          </w:tcPr>
+          <w:p>
+            <w:pPr>
+              <w:spacing w:after="100" w:line="276"/>
+            </w:pPr>
+            <w:r>
+              <w:rPr>
+                <w:b/>
+                <w:bCs/>
+                <w:sz w:val="21"/>
+                <w:szCs w:val="21"/>
+              </w:rPr>
+              <w:t xml:space="preserve">Overall: low risk. </w:t>
+            </w:r>
+            <w:r>
+              <w:rPr>
+                <w:sz w:val="21"/>
+                <w:szCs w:val="21"/>
+              </w:rPr>
+              <w:t xml:space="preserve">The main test is sitting still with two fingertip sensors, which is what a pharmacy pulse oximeter does. The optional breath-hold test is limited to 20 seconds, seated and supervised, and happens only if approved.</w:t>
+            </w:r>
+          </w:p>
+        </w:tc>
+      </w:tr>
+    </w:tbl>
+    <w:p>
+      <w:pPr>
+        <w:spacing w:after="100" w:line="276"/>
+      </w:pPr>
+      <w:r>
+        <w:rPr>
+          <w:sz w:val="21"/>
+          <w:szCs w:val="21"/>
+        </w:rPr>
+        <w:t xml:space="preserve"/>
       </w:r>
     </w:p>
     <w:tbl>
@@ -3348,75 +3422,6 @@
                 <w:szCs w:val="18"/>
               </w:rPr>
               <w:t xml:space="preserve">It is explained beforehand that this is not a medical test and cannot detect or rule out sleep apnea. Unusual readings mean seeing a doctor, not a diagnosis.</w:t>
-            </w:r>
-          </w:p>
-        </w:tc>
-      </w:tr>
-    </w:tbl>
-    <w:p>
-      <w:pPr>
-        <w:spacing w:after="100" w:line="276"/>
-      </w:pPr>
-      <w:r>
-        <w:rPr>
-          <w:sz w:val="21"/>
-          <w:szCs w:val="21"/>
-        </w:rPr>
-        <w:t xml:space="preserve"/>
-      </w:r>
-    </w:p>
-    <w:tbl>
-      <w:tblPr>
-        <w:tblW w:type="dxa" w:w="10080"/>
-        <w:tblBorders>
-          <w:top w:val="single" w:color="auto" w:sz="4"/>
-          <w:left w:val="single" w:color="auto" w:sz="4"/>
-          <w:bottom w:val="single" w:color="auto" w:sz="4"/>
-          <w:right w:val="single" w:color="auto" w:sz="4"/>
-          <w:insideH w:val="single" w:color="auto" w:sz="4"/>
-          <w:insideV w:val="single" w:color="auto" w:sz="4"/>
-        </w:tblBorders>
-      </w:tblPr>
-      <w:tblGrid>
-        <w:gridCol w:w="10080"/>
-      </w:tblGrid>
-      <w:tr>
-        <w:tc>
-          <w:tcPr>
-            <w:tcW w:type="dxa" w:w="10080"/>
-            <w:tcBorders>
-              <w:top w:val="none"/>
-              <w:left w:val="single" w:color="1F8A9C" w:sz="24"/>
-              <w:bottom w:val="none"/>
-              <w:right w:val="none"/>
-            </w:tcBorders>
-            <w:shd w:fill="EAF4F6" w:color="auto" w:val="clear"/>
-            <w:tcMar>
-              <w:top w:type="dxa" w:w="120"/>
-              <w:left w:type="dxa" w:w="180"/>
-              <w:bottom w:type="dxa" w:w="120"/>
-              <w:right w:type="dxa" w:w="180"/>
-            </w:tcMar>
-          </w:tcPr>
-          <w:p>
-            <w:pPr>
-              <w:spacing w:after="100" w:line="276"/>
-            </w:pPr>
-            <w:r>
-              <w:rPr>
-                <w:b/>
-                <w:bCs/>
-                <w:sz w:val="21"/>
-                <w:szCs w:val="21"/>
-              </w:rPr>
-              <w:t xml:space="preserve">Overall: low risk. </w:t>
-            </w:r>
-            <w:r>
-              <w:rPr>
-                <w:sz w:val="21"/>
-                <w:szCs w:val="21"/>
-              </w:rPr>
-              <w:t xml:space="preserve">The main test is sitting still with two fingertip sensors, which is what a pharmacy pulse oximeter does. The optional breath-hold test is limited to 20 seconds, seated and supervised, and happens only if approved.</w:t>
             </w:r>
           </w:p>
         </w:tc>
@@ -9891,6 +9896,11 @@
           <w:szCs w:val="19"/>
         </w:rPr>
         <w:t xml:space="preserve">Stop rules: stop immediately at any dizziness, discomfort or tingling. Stop the session if the reference oximeter reads below 90%. Hold for 20 seconds at most. Always seated. This test checks dip flagging only; it is not a test of sleep apnea.</w:t>
+      </w:r>
+    </w:p>
+    <w:p>
+      <w:r>
+        <w:br w:type="page"/>
       </w:r>
     </w:p>
     <w:p>

</xml_diff>

<commit_message>
Record Ms. Ireland's Oct 9 agreement to the revised scope
Ms. Ireland agreed to refocus on measurement accuracy and desaturation
detection and asked for a revised proposal. Update status wording across
the app, slides, proposal, ethics package, guides and review; add her
supervisor details from her email signature, the Technoscience
pre-questionnaire link and steps, and a draft cover email (not sent).
Fix the review PDF checklist formatting.

Co-Authored-By: Claude Opus 5.5 <noreply@anthropic.com>
Claude-Session: https://claude.ai/code/session_01CxrUMy4UZKTNYh6kiz9919
</commit_message>
<xml_diff>
--- a/science-fair/night-signal/Night_Signal_Ethics.docx
+++ b/science-fair/night-signal/Night_Signal_Ethics.docx
@@ -30,17 +30,7 @@
           <w:sz w:val="21"/>
           <w:szCs w:val="21"/>
         </w:rPr>
-        <w:t xml:space="preserve">Gabriel Mamane · Science Fair 2027 · Human participants · Due </w:t>
-      </w:r>
-      <w:r>
-        <w:rPr>
-          <w:b/>
-          <w:bCs/>
-          <w:color w:val="555F6B"/>
-          <w:sz w:val="21"/>
-          <w:szCs w:val="21"/>
-        </w:rPr>
-        <w:t xml:space="preserve">October 13</w:t>
+        <w:t xml:space="preserve">Gabriel Mamane · Science Fair 2027 · Human participants · Requested by Ms. Ireland on Oct 9 (original due date: October 13)</w:t>
       </w:r>
     </w:p>
     <w:tbl>
@@ -100,7 +90,7 @@
                 <w:sz w:val="21"/>
                 <w:szCs w:val="21"/>
               </w:rPr>
-              <w:t xml:space="preserve">This package reflects the revised scope proposed to Ms. Ireland (wearable measurement accuracy and oxygen desaturation detection). </w:t>
+              <w:t xml:space="preserve">On October 9, Ms. Ireland agreed that the project should focus on wearable measurement accuracy and oxygen desaturation detection, and asked for a revised proposal. </w:t>
             </w:r>
             <w:r>
               <w:rPr>
@@ -109,14 +99,14 @@
                 <w:sz w:val="21"/>
                 <w:szCs w:val="21"/>
               </w:rPr>
-              <w:t xml:space="preserve">Her approval of that scope is still pending. </w:t>
+              <w:t xml:space="preserve">She accepts the project only after reviewing that revised proposal. </w:t>
             </w:r>
             <w:r>
               <w:rPr>
                 <w:sz w:val="21"/>
                 <w:szCs w:val="21"/>
               </w:rPr>
-              <w:t xml:space="preserve">No approval, certificate, consent or signature has been obtained yet, and no data has been collected from anyone. Nothing in this package should be submitted until the student has checked it and confirmed with Ms. Ireland.</w:t>
+              <w:t xml:space="preserve">No ethics approval, certificate, consent or signature has been obtained yet, and no data has been collected from anyone. The student checks and submits this package; nothing here has been submitted.</w:t>
             </w:r>
           </w:p>
         </w:tc>
@@ -196,7 +186,7 @@
                 <w:sz w:val="21"/>
                 <w:szCs w:val="21"/>
               </w:rPr>
-              <w:t xml:space="preserve">Confirm with Ms. Ireland that the revised scope is accepted (or ask whether the ethics submission should go ahead in parallel).</w:t>
+              <w:t xml:space="preserve">Send the revised proposal to Ms. Ireland (she asked for it on October 9).</w:t>
             </w:r>
           </w:p>
           <w:p>
@@ -230,7 +220,7 @@
                 <w:sz w:val="21"/>
                 <w:szCs w:val="21"/>
               </w:rPr>
-              <w:t xml:space="preserve"> box: grade, supervisor's name, school and contact details.</w:t>
+              <w:t xml:space="preserve"> box: your grade and Ms. Ireland's email address.</w:t>
             </w:r>
           </w:p>
           <w:p>
@@ -247,7 +237,7 @@
                 <w:sz w:val="21"/>
                 <w:szCs w:val="21"/>
               </w:rPr>
-              <w:t xml:space="preserve">Go to </w:t>
+              <w:t xml:space="preserve">Create an account and answer the pre-questionnaire at </w:t>
             </w:r>
             <w:r>
               <w:rPr>
@@ -256,14 +246,14 @@
                 <w:sz w:val="21"/>
                 <w:szCs w:val="21"/>
               </w:rPr>
-              <w:t xml:space="preserve">approbation.technoscience.ca</w:t>
+              <w:t xml:space="preserve">approbation.technoscience.ca/pre-questionnaire</w:t>
             </w:r>
             <w:r>
               <w:rPr>
                 <w:sz w:val="21"/>
                 <w:szCs w:val="21"/>
               </w:rPr>
-              <w:t xml:space="preserve"> and answer the pre-questionnaire. Section 1 lists the questions it will most likely ask; check them against the real platform.</w:t>
+              <w:t xml:space="preserve">. Ms. Ireland asked for this now because of time constraints, even though it is formally required only for projects accepted to the regional fair. Section 1 lists the questions it will most likely ask; check them against the real platform.</w:t>
             </w:r>
           </w:p>
           <w:p>
@@ -280,7 +270,7 @@
                 <w:sz w:val="21"/>
                 <w:szCs w:val="21"/>
               </w:rPr>
-              <w:t xml:space="preserve">When the platform asks for the ethics form, use sections 2 to 4 (summary, protocol, risk assessment), and attach the blank data sheets in section 6.</w:t>
+              <w:t xml:space="preserve">The ethics form comes after the pre-questionnaire. Use sections 2 to 4 (summary, protocol, risk assessment), and attach the blank data sheets in section 6.</w:t>
             </w:r>
           </w:p>
           <w:p>
@@ -343,7 +333,7 @@
           <w:sz w:val="21"/>
           <w:szCs w:val="21"/>
         </w:rPr>
-        <w:t xml:space="preserve">the approval website could not be opened while preparing this draft, so section 1 is a best guess at its questions. The rest follows what Technoscience asks for: protocol, risk assessment, data collection tools, supervisor details and consent.</w:t>
+        <w:t xml:space="preserve">the approval website could not be opened while preparing this draft, so section 1 is a best guess at its questions. Per Ms. Ireland, the form appears after the pre-questionnaire and requires an account. The rest follows what Technoscience asks for: protocol, risk assessment, data collection tools, supervisor details and consent.</w:t>
       </w:r>
     </w:p>
     <w:p>
@@ -531,7 +521,14 @@
                 <w:szCs w:val="21"/>
                 <w:shd w:fill="FFE97A" w:color="auto" w:val="clear"/>
               </w:rPr>
-              <w:t xml:space="preserve">Grade __ · school name</w:t>
+              <w:t xml:space="preserve">Grade __</w:t>
+            </w:r>
+            <w:r>
+              <w:rPr>
+                <w:sz w:val="21"/>
+                <w:szCs w:val="21"/>
+              </w:rPr>
+              <w:t xml:space="preserve"> · Les écoles Azrieli Herzliah, Campus Sylvan Adams</w:t>
             </w:r>
           </w:p>
         </w:tc>
@@ -558,7 +555,7 @@
                 <w:sz w:val="20"/>
                 <w:szCs w:val="20"/>
               </w:rPr>
-              <w:t xml:space="preserve">Scientific supervisor (adult)</w:t>
+              <w:t xml:space="preserve">Supervising teacher (adult)</w:t>
             </w:r>
           </w:p>
         </w:tc>
@@ -574,8 +571,67 @@
           </w:tcPr>
           <w:p>
             <w:pPr>
+              <w:spacing w:after="0" w:line="252"/>
+            </w:pPr>
+            <w:r>
+              <w:rPr>
+                <w:b w:val="false"/>
+                <w:bCs w:val="false"/>
+                <w:sz w:val="20"/>
+                <w:szCs w:val="20"/>
+              </w:rPr>
+              <w:t xml:space="preserve">Ms. Jessica Ireland, Science Department; Head teacher for Secondary 5</w:t>
+            </w:r>
+          </w:p>
+        </w:tc>
+      </w:tr>
+      <w:tr>
+        <w:tc>
+          <w:tcPr>
+            <w:tcW w:type="dxa" w:w="3600"/>
+            <w:tcMar>
+              <w:top w:type="dxa" w:w="60"/>
+              <w:left w:type="dxa" w:w="100"/>
+              <w:bottom w:type="dxa" w:w="60"/>
+              <w:right w:type="dxa" w:w="100"/>
+            </w:tcMar>
+          </w:tcPr>
+          <w:p>
+            <w:pPr>
+              <w:spacing w:after="0" w:line="252"/>
+            </w:pPr>
+            <w:r>
+              <w:rPr>
+                <w:b w:val="false"/>
+                <w:bCs w:val="false"/>
+                <w:sz w:val="20"/>
+                <w:szCs w:val="20"/>
+              </w:rPr>
+              <w:t xml:space="preserve">Supervisor's institution and contact</w:t>
+            </w:r>
+          </w:p>
+        </w:tc>
+        <w:tc>
+          <w:tcPr>
+            <w:tcW w:type="dxa" w:w="6480"/>
+            <w:tcMar>
+              <w:top w:type="dxa" w:w="60"/>
+              <w:left w:type="dxa" w:w="100"/>
+              <w:bottom w:type="dxa" w:w="60"/>
+              <w:right w:type="dxa" w:w="100"/>
+            </w:tcMar>
+          </w:tcPr>
+          <w:p>
+            <w:pPr>
               <w:spacing w:after="0"/>
             </w:pPr>
+            <w:r>
+              <w:rPr>
+                <w:sz w:val="21"/>
+                <w:szCs w:val="21"/>
+              </w:rPr>
+              <w:t xml:space="preserve">Les écoles Azrieli Herzliah, Campus Sylvan Adams, 5475 avenue Mountain Sights, Montréal, QC H3W 2Y8 · 514-739-2291, ext. 255 · </w:t>
+            </w:r>
             <w:r>
               <w:rPr>
                 <w:b/>
@@ -584,7 +640,7 @@
                 <w:szCs w:val="21"/>
                 <w:shd w:fill="FFE97A" w:color="auto" w:val="clear"/>
               </w:rPr>
-              <w:t xml:space="preserve">Name and role (confirm who this is)</w:t>
+              <w:t xml:space="preserve">email</w:t>
             </w:r>
           </w:p>
         </w:tc>
@@ -611,7 +667,7 @@
                 <w:sz w:val="20"/>
                 <w:szCs w:val="20"/>
               </w:rPr>
-              <w:t xml:space="preserve">Supervisor's institution and contact</w:t>
+              <w:t xml:space="preserve">Project title</w:t>
             </w:r>
           </w:p>
         </w:tc>
@@ -627,17 +683,16 @@
           </w:tcPr>
           <w:p>
             <w:pPr>
-              <w:spacing w:after="0"/>
-            </w:pPr>
-            <w:r>
-              <w:rPr>
-                <w:b/>
-                <w:bCs/>
-                <w:sz w:val="21"/>
-                <w:szCs w:val="21"/>
-                <w:shd w:fill="FFE97A" w:color="auto" w:val="clear"/>
-              </w:rPr>
-              <w:t xml:space="preserve">School name, address, email, phone</w:t>
+              <w:spacing w:after="0" w:line="252"/>
+            </w:pPr>
+            <w:r>
+              <w:rPr>
+                <w:b w:val="false"/>
+                <w:bCs w:val="false"/>
+                <w:sz w:val="20"/>
+                <w:szCs w:val="20"/>
+              </w:rPr>
+              <w:t xml:space="preserve">Night Signal: SpO2 Accuracy (revised; original title was “Night Signal: Apnea Detector”)</w:t>
             </w:r>
           </w:p>
         </w:tc>
@@ -664,7 +719,7 @@
                 <w:sz w:val="20"/>
                 <w:szCs w:val="20"/>
               </w:rPr>
-              <w:t xml:space="preserve">Project title</w:t>
+              <w:t xml:space="preserve">Category</w:t>
             </w:r>
           </w:p>
         </w:tc>
@@ -689,7 +744,7 @@
                 <w:sz w:val="20"/>
                 <w:szCs w:val="20"/>
               </w:rPr>
-              <w:t xml:space="preserve">Night Signal: SpO2 Accuracy (revised; original title was “Night Signal: Apnea Detector”)</w:t>
+              <w:t xml:space="preserve">Health and Medical Sciences · Experimental project</w:t>
             </w:r>
           </w:p>
         </w:tc>
@@ -716,7 +771,7 @@
                 <w:sz w:val="20"/>
                 <w:szCs w:val="20"/>
               </w:rPr>
-              <w:t xml:space="preserve">Category</w:t>
+              <w:t xml:space="preserve">Planned test dates</w:t>
             </w:r>
           </w:p>
         </w:tc>
@@ -741,59 +796,7 @@
                 <w:sz w:val="20"/>
                 <w:szCs w:val="20"/>
               </w:rPr>
-              <w:t xml:space="preserve">Health and Medical Sciences · Experimental project</w:t>
-            </w:r>
-          </w:p>
-        </w:tc>
-      </w:tr>
-      <w:tr>
-        <w:tc>
-          <w:tcPr>
-            <w:tcW w:type="dxa" w:w="3600"/>
-            <w:tcMar>
-              <w:top w:type="dxa" w:w="60"/>
-              <w:left w:type="dxa" w:w="100"/>
-              <w:bottom w:type="dxa" w:w="60"/>
-              <w:right w:type="dxa" w:w="100"/>
-            </w:tcMar>
-          </w:tcPr>
-          <w:p>
-            <w:pPr>
-              <w:spacing w:after="0" w:line="252"/>
-            </w:pPr>
-            <w:r>
-              <w:rPr>
-                <w:b w:val="false"/>
-                <w:bCs w:val="false"/>
-                <w:sz w:val="20"/>
-                <w:szCs w:val="20"/>
-              </w:rPr>
-              <w:t xml:space="preserve">Planned test dates</w:t>
-            </w:r>
-          </w:p>
-        </w:tc>
-        <w:tc>
-          <w:tcPr>
-            <w:tcW w:type="dxa" w:w="6480"/>
-            <w:tcMar>
-              <w:top w:type="dxa" w:w="60"/>
-              <w:left w:type="dxa" w:w="100"/>
-              <w:bottom w:type="dxa" w:w="60"/>
-              <w:right w:type="dxa" w:w="100"/>
-            </w:tcMar>
-          </w:tcPr>
-          <w:p>
-            <w:pPr>
-              <w:spacing w:after="0" w:line="252"/>
-            </w:pPr>
-            <w:r>
-              <w:rPr>
-                <w:b w:val="false"/>
-                <w:bCs w:val="false"/>
-                <w:sz w:val="20"/>
-                <w:szCs w:val="20"/>
-              </w:rPr>
-              <w:t xml:space="preserve">Only after scope approval, ethics approval and signed consent; target October to December (before the January 11 final slides)</w:t>
+              <w:t xml:space="preserve">Only after Ms. Ireland accepts the revised proposal, ethics approval is issued and consent is signed; target October to December (before the January 11 final slides)</w:t>
             </w:r>
           </w:p>
         </w:tc>
@@ -3667,17 +3670,7 @@
           <w:sz w:val="21"/>
           <w:szCs w:val="21"/>
         </w:rPr>
-        <w:t xml:space="preserve">Gabriel Mamane, or the supervisor: </w:t>
-      </w:r>
-      <w:r>
-        <w:rPr>
-          <w:b/>
-          <w:bCs/>
-          <w:sz w:val="21"/>
-          <w:szCs w:val="21"/>
-          <w:shd w:fill="FFE97A" w:color="auto" w:val="clear"/>
-        </w:rPr>
-        <w:t xml:space="preserve">name, email</w:t>
+        <w:t xml:space="preserve">Gabriel Mamane, or the supervising teacher, Ms. Jessica Ireland (Les écoles Azrieli Herzliah, 514-739-2291, ext. 255)</w:t>
       </w:r>
     </w:p>
     <w:p>

</xml_diff>